<commit_message>
Staging Build v1.938 - 2026-09-27 14:32:44
</commit_message>
<xml_diff>
--- a/my-react-app/Plannung/Lequidität/Girokonto.docx
+++ b/my-react-app/Plannung/Lequidität/Girokonto.docx
@@ -136,16 +136,249 @@
         <w:spacing w:after="0"/>
       </w:pPr>
       <w:r>
-        <w:t xml:space="preserve">Name des Kontos, Name der Bank, Land der Bank, IBAN, BIC, Kontoinhaber, Einzahlung bei Eröffnung, Eröffnungsdatum, </w:t>
-      </w:r>
-      <w:r>
-        <w:t>notizen</w:t>
-      </w:r>
-      <w:r>
-        <w:t>, erstellt am, eröffnet am, asset id, ist aktiv, hauptkonto,</w:t>
-      </w:r>
-      <w:r>
-        <w:t xml:space="preserve"> elternkonto, dispo limit, zinssatz, ist refernzkonto, benutzer id (es können noch weitere hinzukommen)</w:t>
+        <w:rPr>
+          <w:bCs/>
+        </w:rPr>
+        <w:t>Kontoname / Bezeichnung</w:t>
+      </w:r>
+      <w:r>
+        <w:rPr>
+          <w:bCs/>
+        </w:rPr>
+        <w:t>,</w:t>
+      </w:r>
+      <w:r>
+        <w:t xml:space="preserve"> </w:t>
+      </w:r>
+      <w:r>
+        <w:rPr>
+          <w:bCs/>
+        </w:rPr>
+        <w:t>Bankinstitut</w:t>
+      </w:r>
+      <w:r>
+        <w:rPr>
+          <w:bCs/>
+        </w:rPr>
+        <w:t xml:space="preserve">, </w:t>
+      </w:r>
+      <w:r>
+        <w:rPr>
+          <w:bCs/>
+        </w:rPr>
+        <w:t>IBAN</w:t>
+      </w:r>
+      <w:r>
+        <w:rPr>
+          <w:bCs/>
+        </w:rPr>
+        <w:t>,</w:t>
+      </w:r>
+      <w:r>
+        <w:t xml:space="preserve"> </w:t>
+      </w:r>
+      <w:r>
+        <w:rPr>
+          <w:bCs/>
+        </w:rPr>
+        <w:t>BIC / SWIFT-Code</w:t>
+      </w:r>
+      <w:r>
+        <w:rPr>
+          <w:bCs/>
+        </w:rPr>
+        <w:t xml:space="preserve">, </w:t>
+      </w:r>
+      <w:r>
+        <w:rPr>
+          <w:bCs/>
+        </w:rPr>
+        <w:t>Kontowährung</w:t>
+      </w:r>
+      <w:r>
+        <w:rPr>
+          <w:bCs/>
+        </w:rPr>
+        <w:t xml:space="preserve">, </w:t>
+      </w:r>
+      <w:r>
+        <w:rPr>
+          <w:bCs/>
+        </w:rPr>
+        <w:t>Kontoart</w:t>
+      </w:r>
+      <w:r>
+        <w:rPr>
+          <w:bCs/>
+        </w:rPr>
+        <w:t xml:space="preserve">, </w:t>
+      </w:r>
+      <w:r>
+        <w:rPr>
+          <w:bCs/>
+        </w:rPr>
+        <w:t>Kontoinhaber</w:t>
+      </w:r>
+      <w:r>
+        <w:rPr>
+          <w:bCs/>
+        </w:rPr>
+        <w:t xml:space="preserve">, </w:t>
+      </w:r>
+      <w:r>
+        <w:rPr>
+          <w:bCs/>
+        </w:rPr>
+        <w:t>Elternkonto</w:t>
+      </w:r>
+      <w:r>
+        <w:rPr>
+          <w:bCs/>
+        </w:rPr>
+        <w:t xml:space="preserve">, </w:t>
+      </w:r>
+      <w:r>
+        <w:rPr>
+          <w:bCs/>
+        </w:rPr>
+        <w:t>Status</w:t>
+      </w:r>
+      <w:r>
+        <w:rPr>
+          <w:bCs/>
+        </w:rPr>
+        <w:t xml:space="preserve">, </w:t>
+      </w:r>
+      <w:r>
+        <w:rPr>
+          <w:bCs/>
+        </w:rPr>
+        <w:t>Aktuelles Guthaben</w:t>
+      </w:r>
+      <w:r>
+        <w:rPr>
+          <w:bCs/>
+        </w:rPr>
+        <w:t xml:space="preserve">, </w:t>
+      </w:r>
+      <w:r>
+        <w:rPr>
+          <w:bCs/>
+        </w:rPr>
+        <w:t>Verfügbarer Betrag (inkl. Dispo)</w:t>
+      </w:r>
+      <w:r>
+        <w:rPr>
+          <w:bCs/>
+        </w:rPr>
+        <w:t xml:space="preserve">, </w:t>
+      </w:r>
+      <w:r>
+        <w:rPr>
+          <w:bCs/>
+        </w:rPr>
+        <w:t>Dispolimit</w:t>
+      </w:r>
+      <w:r>
+        <w:rPr>
+          <w:bCs/>
+        </w:rPr>
+        <w:t xml:space="preserve">, </w:t>
+      </w:r>
+      <w:r>
+        <w:rPr>
+          <w:bCs/>
+        </w:rPr>
+        <w:t>Transaktionshistorie</w:t>
+      </w:r>
+      <w:r>
+        <w:rPr>
+          <w:bCs/>
+        </w:rPr>
+        <w:t xml:space="preserve">, </w:t>
+      </w:r>
+      <w:r>
+        <w:rPr>
+          <w:bCs/>
+        </w:rPr>
+        <w:t>Notizen</w:t>
+      </w:r>
+      <w:r>
+        <w:rPr>
+          <w:bCs/>
+        </w:rPr>
+        <w:t xml:space="preserve">, </w:t>
+      </w:r>
+      <w:proofErr w:type="spellStart"/>
+      <w:r>
+        <w:t>zinssatz</w:t>
+      </w:r>
+      <w:proofErr w:type="spellEnd"/>
+      <w:r>
+        <w:t xml:space="preserve">, ist </w:t>
+      </w:r>
+      <w:proofErr w:type="spellStart"/>
+      <w:r>
+        <w:t>refernzkonto</w:t>
+      </w:r>
+      <w:proofErr w:type="spellEnd"/>
+      <w:r>
+        <w:t xml:space="preserve">, </w:t>
+      </w:r>
+      <w:proofErr w:type="spellStart"/>
+      <w:r>
+        <w:t>benutzer</w:t>
+      </w:r>
+      <w:proofErr w:type="spellEnd"/>
+      <w:r>
+        <w:t xml:space="preserve"> </w:t>
+      </w:r>
+      <w:proofErr w:type="spellStart"/>
+      <w:r>
+        <w:t>id</w:t>
+      </w:r>
+      <w:proofErr w:type="spellEnd"/>
+      <w:r>
+        <w:t xml:space="preserve">, </w:t>
+      </w:r>
+      <w:proofErr w:type="spellStart"/>
+      <w:r>
+        <w:t>asset</w:t>
+      </w:r>
+      <w:proofErr w:type="spellEnd"/>
+      <w:r>
+        <w:t xml:space="preserve"> </w:t>
+      </w:r>
+      <w:proofErr w:type="spellStart"/>
+      <w:r>
+        <w:t>id</w:t>
+      </w:r>
+      <w:proofErr w:type="spellEnd"/>
+      <w:r>
+        <w:t>, Einzahlung bei Eröffnung, Eröffnungsdatum</w:t>
+      </w:r>
+      <w:r>
+        <w:t xml:space="preserve">, </w:t>
+      </w:r>
+      <w:r>
+        <w:t>Land der Bank,</w:t>
+      </w:r>
+      <w:r>
+        <w:t xml:space="preserve"> </w:t>
+      </w:r>
+      <w:proofErr w:type="spellStart"/>
+      <w:r>
+        <w:t>hauptkonto</w:t>
+      </w:r>
+      <w:proofErr w:type="spellEnd"/>
+      <w:r>
+        <w:t>,</w:t>
+      </w:r>
+      <w:r>
+        <w:t xml:space="preserve"> </w:t>
+      </w:r>
+      <w:r>
+        <w:t>erstellt am, eröffnet am</w:t>
       </w:r>
     </w:p>
     <w:p>
@@ -253,11 +486,11 @@
         <w:t>gleichzeitig</w:t>
       </w:r>
       <w:r>
-        <w:t xml:space="preserve"> und es ist eine Card mit den wichtigsten Daten zu seinem Girokonto zu sehen. Der Aufbau mit den Cards gleicht einem Kanban Board. Diese Ansicht kann der User allerdings jederzeit anpassen und zu einer Tabellenansicht </w:t>
+        <w:t xml:space="preserve"> und es ist eine Card mit den wichtigsten Daten zu seinem Girokonto zu sehen. Der Aufbau mit den Cards gleicht einem Kanban Board. Diese </w:t>
       </w:r>
       <w:r>
         <w:lastRenderedPageBreak/>
-        <w:t xml:space="preserve">switchen.  In der untersten linken Ecke jeder Card gibt es den Detail Button. Klickt der User auf diesen, so kommt er zu einer Detailansicht des spezifischen Girokontos. Diese Seite ist in verschiedene Bereiche unterteilt. </w:t>
+        <w:t xml:space="preserve">Ansicht kann der User allerdings jederzeit anpassen und zu einer Tabellenansicht switchen.  In der untersten linken Ecke jeder Card gibt es den Detail Button. Klickt der User auf diesen, so kommt er zu einer Detailansicht des spezifischen Girokontos. Diese Seite ist in verschiedene Bereiche unterteilt. </w:t>
       </w:r>
       <w:r>
         <w:t xml:space="preserve">Oben stehen die ganzen Stammdaten. Darunter sind dann die Transaktionen zusehen. Hier kann der User dann auch manuell Transaktionen anlegen. Das Anlegen findet über ein Modal statt. Hier gibt der User die Summe an, ob es eine Ausgabe/Einnahmen ist, den Empfänger und wenn er möchte auch noch eine Kategorie (die Erweiterung des Modals ist während der Entwicklung möglich). Gedacht ist aber eigentlich das es APIs zu möglichst vielen Banken gibt, wodurch die Transaktionen dann automatisch importiert werden. Zudem soll dem User ermöglicht werden Transaktionen anzupassen. Allerdings wird hierbei </w:t>
@@ -319,9 +552,11 @@
       <w:r>
         <w:t xml:space="preserve">[  ] Code zum </w:t>
       </w:r>
+      <w:proofErr w:type="spellStart"/>
       <w:r>
         <w:t>bearbeiten</w:t>
       </w:r>
+      <w:proofErr w:type="spellEnd"/>
       <w:r>
         <w:t xml:space="preserve"> eines Girokontos ist geschrieben und getestet</w:t>
       </w:r>
@@ -331,13 +566,7 @@
         <w:spacing w:after="0"/>
       </w:pPr>
       <w:r>
-        <w:t>[  ] Code zum Anlegen eine</w:t>
-      </w:r>
-      <w:r>
-        <w:t xml:space="preserve">r Transaktion </w:t>
-      </w:r>
-      <w:r>
-        <w:t>ist geschrieben und getestet</w:t>
+        <w:t>[  ] Code zum Anlegen einer Transaktion ist geschrieben und getestet</w:t>
       </w:r>
     </w:p>
     <w:p>
@@ -347,31 +576,21 @@
       <w:r>
         <w:t xml:space="preserve">[  ] Code zum </w:t>
       </w:r>
+      <w:proofErr w:type="spellStart"/>
       <w:r>
         <w:t>bearbeiten</w:t>
       </w:r>
-      <w:r>
-        <w:t xml:space="preserve"> eine</w:t>
-      </w:r>
-      <w:r>
-        <w:t>r Transaktion</w:t>
-      </w:r>
-      <w:r>
-        <w:t xml:space="preserve"> ist geschrieben und getestet</w:t>
-      </w:r>
-    </w:p>
-    <w:p>
-      <w:pPr>
-        <w:spacing w:after="0"/>
-      </w:pPr>
-      <w:r>
-        <w:t xml:space="preserve">[  ] Code zum Anlegen </w:t>
-      </w:r>
-      <w:r>
-        <w:t>von Dokumenten</w:t>
-      </w:r>
-      <w:r>
-        <w:t xml:space="preserve"> ist geschrieben und getestet</w:t>
+      <w:proofErr w:type="spellEnd"/>
+      <w:r>
+        <w:t xml:space="preserve"> einer Transaktion ist geschrieben und getestet</w:t>
+      </w:r>
+    </w:p>
+    <w:p>
+      <w:pPr>
+        <w:spacing w:after="0"/>
+      </w:pPr>
+      <w:r>
+        <w:t>[  ] Code zum Anlegen von Dokumenten ist geschrieben und getestet</w:t>
       </w:r>
     </w:p>
     <w:p>
@@ -381,9 +600,11 @@
       <w:r>
         <w:t xml:space="preserve">[  ] Code zum </w:t>
       </w:r>
+      <w:proofErr w:type="spellStart"/>
       <w:r>
         <w:t>löschen</w:t>
       </w:r>
+      <w:proofErr w:type="spellEnd"/>
       <w:r>
         <w:t xml:space="preserve"> eines Girokontos ist geschrieben und getestet</w:t>
       </w:r>
@@ -395,11 +616,13 @@
       <w:r>
         <w:t xml:space="preserve">[  ] Code zum </w:t>
       </w:r>
-      <w:r>
-        <w:t>wiederherstellen von Datensätzen</w:t>
-      </w:r>
-      <w:r>
-        <w:t xml:space="preserve"> ist geschrieben und getestet</w:t>
+      <w:proofErr w:type="spellStart"/>
+      <w:r>
+        <w:t>wiederherstellen</w:t>
+      </w:r>
+      <w:proofErr w:type="spellEnd"/>
+      <w:r>
+        <w:t xml:space="preserve"> von Datensätzen ist geschrieben und getestet</w:t>
       </w:r>
     </w:p>
     <w:p>
@@ -409,11 +632,21 @@
       <w:r>
         <w:t xml:space="preserve">[  ] Code zum </w:t>
       </w:r>
-      <w:r>
-        <w:t>anzeigen von Push Nachrichten</w:t>
-      </w:r>
-      <w:r>
-        <w:t xml:space="preserve"> ist geschrieben und getestet</w:t>
+      <w:proofErr w:type="spellStart"/>
+      <w:r>
+        <w:t>anzeigen</w:t>
+      </w:r>
+      <w:proofErr w:type="spellEnd"/>
+      <w:r>
+        <w:t xml:space="preserve"> von Push Nachrichten ist geschrieben und getestet</w:t>
+      </w:r>
+    </w:p>
+    <w:p>
+      <w:pPr>
+        <w:spacing w:after="0"/>
+      </w:pPr>
+      <w:r>
+        <w:t>[  ] Code zum für die Feldvalidierung ist geschrieben und getestet</w:t>
       </w:r>
     </w:p>
     <w:p>
@@ -423,25 +656,13 @@
       <w:r>
         <w:t xml:space="preserve">[  ] Code zum </w:t>
       </w:r>
-      <w:r>
-        <w:t>für die Feldvalidierung</w:t>
-      </w:r>
-      <w:r>
-        <w:t xml:space="preserve"> ist geschrieben und getestet</w:t>
-      </w:r>
-    </w:p>
-    <w:p>
-      <w:pPr>
-        <w:spacing w:after="0"/>
-      </w:pPr>
-      <w:r>
-        <w:t xml:space="preserve">[  ] Code zum </w:t>
-      </w:r>
-      <w:r>
-        <w:t>anpassen der Ansicht</w:t>
-      </w:r>
-      <w:r>
-        <w:t xml:space="preserve"> geschrieben und getestet</w:t>
+      <w:proofErr w:type="spellStart"/>
+      <w:r>
+        <w:t>anpassen</w:t>
+      </w:r>
+      <w:proofErr w:type="spellEnd"/>
+      <w:r>
+        <w:t xml:space="preserve"> der Ansicht geschrieben und getestet</w:t>
       </w:r>
     </w:p>
     <w:p>
@@ -1062,7 +1283,6 @@
   <w:style w:type="character" w:default="1" w:styleId="Absatz-Standardschriftart">
     <w:name w:val="Default Paragraph Font"/>
     <w:uiPriority w:val="1"/>
-    <w:semiHidden/>
     <w:unhideWhenUsed/>
   </w:style>
   <w:style w:type="table" w:default="1" w:styleId="NormaleTabelle">

</xml_diff>